<commit_message>
Show event type and status on cards
</commit_message>
<xml_diff>
--- a/coursework-documents/COMP1786_CW2_Exercise_2_Logbook.docx
+++ b/coursework-documents/COMP1786_CW2_Exercise_2_Logbook.docx
@@ -15367,79 +15367,295 @@
                 <w:color w:val="000000"/>
                 <w:sz w:val="22"/>
               </w:rPr>
-              <w:t xml:space="preserve">            Text(</w:t>
-            </w:r>
-          </w:p>
-          <w:p>
-            <w:pPr>
-              <w:keepNext w:val="0"/>
-              <w:keepLines w:val="0"/>
-              <w:spacing w:before="0" w:after="0" w:line="240" w:lineRule="auto"/>
-              <w:ind w:left="0" w:right="0" w:firstLine="0"/>
-            </w:pPr>
-            <w:r>
-              <w:rPr>
-                <w:rFonts w:ascii="Courier New" w:hAnsi="Courier New" w:eastAsia="Courier New" w:cs="Courier New"/>
-                <w:b w:val="0"/>
-                <w:i w:val="0"/>
-                <w:color w:val="000000"/>
-                <w:sz w:val="22"/>
-              </w:rPr>
-              <w:t xml:space="preserve">                "${item.event.eventType.label} • ${item.event.status.label}",</w:t>
-            </w:r>
-          </w:p>
-          <w:p>
-            <w:pPr>
-              <w:keepNext w:val="0"/>
-              <w:keepLines w:val="0"/>
-              <w:spacing w:before="0" w:after="0" w:line="240" w:lineRule="auto"/>
-              <w:ind w:left="0" w:right="0" w:firstLine="0"/>
-            </w:pPr>
-            <w:r>
-              <w:rPr>
-                <w:rFonts w:ascii="Courier New" w:hAnsi="Courier New" w:eastAsia="Courier New" w:cs="Courier New"/>
-                <w:b w:val="0"/>
-                <w:i w:val="0"/>
-                <w:color w:val="000000"/>
-                <w:sz w:val="22"/>
-              </w:rPr>
-              <w:t xml:space="preserve">                style = MaterialTheme.typography.labelLarge,</w:t>
-            </w:r>
-          </w:p>
-          <w:p>
-            <w:pPr>
-              <w:keepNext w:val="0"/>
-              <w:keepLines w:val="0"/>
-              <w:spacing w:before="0" w:after="0" w:line="240" w:lineRule="auto"/>
-              <w:ind w:left="0" w:right="0" w:firstLine="0"/>
-            </w:pPr>
-            <w:r>
-              <w:rPr>
-                <w:rFonts w:ascii="Courier New" w:hAnsi="Courier New" w:eastAsia="Courier New" w:cs="Courier New"/>
-                <w:b w:val="0"/>
-                <w:i w:val="0"/>
-                <w:color w:val="000000"/>
-                <w:sz w:val="22"/>
-              </w:rPr>
-              <w:t xml:space="preserve">                color = MaterialTheme.colorScheme.primary</w:t>
-            </w:r>
-          </w:p>
-          <w:p>
-            <w:pPr>
-              <w:keepNext w:val="0"/>
-              <w:keepLines w:val="0"/>
-              <w:spacing w:before="0" w:after="0" w:line="240" w:lineRule="auto"/>
-              <w:ind w:left="0" w:right="0" w:firstLine="0"/>
-            </w:pPr>
-            <w:r>
-              <w:rPr>
-                <w:rFonts w:ascii="Courier New" w:hAnsi="Courier New" w:eastAsia="Courier New" w:cs="Courier New"/>
-                <w:b w:val="0"/>
-                <w:i w:val="0"/>
-                <w:color w:val="000000"/>
-                <w:sz w:val="22"/>
-              </w:rPr>
-              <w:t xml:space="preserve">            )</w:t>
+              <w:t xml:space="preserve">            Row(</w:t>
+            </w:r>
+          </w:p>
+          <w:p>
+            <w:pPr>
+              <w:keepNext w:val="0"/>
+              <w:keepLines w:val="0"/>
+              <w:spacing w:before="0" w:after="0" w:line="240" w:lineRule="auto"/>
+              <w:ind w:left="0" w:right="0" w:firstLine="0"/>
+            </w:pPr>
+            <w:r>
+              <w:rPr>
+                <w:rFonts w:ascii="Courier New" w:hAnsi="Courier New" w:eastAsia="Courier New" w:cs="Courier New"/>
+                <w:b w:val="0"/>
+                <w:i w:val="0"/>
+                <w:color w:val="000000"/>
+                <w:sz w:val="22"/>
+              </w:rPr>
+              <w:t xml:space="preserve">                modifier = Modifier.fillMaxWidth(),</w:t>
+            </w:r>
+          </w:p>
+          <w:p>
+            <w:pPr>
+              <w:keepNext w:val="0"/>
+              <w:keepLines w:val="0"/>
+              <w:spacing w:before="0" w:after="0" w:line="240" w:lineRule="auto"/>
+              <w:ind w:left="0" w:right="0" w:firstLine="0"/>
+            </w:pPr>
+            <w:r>
+              <w:rPr>
+                <w:rFonts w:ascii="Courier New" w:hAnsi="Courier New" w:eastAsia="Courier New" w:cs="Courier New"/>
+                <w:b w:val="0"/>
+                <w:i w:val="0"/>
+                <w:color w:val="000000"/>
+                <w:sz w:val="22"/>
+              </w:rPr>
+              <w:t xml:space="preserve">                horizontalArrangement = Arrangement.spacedBy(12.dp)</w:t>
+            </w:r>
+          </w:p>
+          <w:p>
+            <w:pPr>
+              <w:keepNext w:val="0"/>
+              <w:keepLines w:val="0"/>
+              <w:spacing w:before="0" w:after="0" w:line="240" w:lineRule="auto"/>
+              <w:ind w:left="0" w:right="0" w:firstLine="0"/>
+            </w:pPr>
+            <w:r>
+              <w:rPr>
+                <w:rFonts w:ascii="Courier New" w:hAnsi="Courier New" w:eastAsia="Courier New" w:cs="Courier New"/>
+                <w:b w:val="0"/>
+                <w:i w:val="0"/>
+                <w:color w:val="000000"/>
+                <w:sz w:val="22"/>
+              </w:rPr>
+              <w:t xml:space="preserve">            ) {</w:t>
+            </w:r>
+          </w:p>
+          <w:p>
+            <w:pPr>
+              <w:keepNext w:val="0"/>
+              <w:keepLines w:val="0"/>
+              <w:spacing w:before="0" w:after="0" w:line="240" w:lineRule="auto"/>
+              <w:ind w:left="0" w:right="0" w:firstLine="0"/>
+            </w:pPr>
+            <w:r>
+              <w:rPr>
+                <w:rFonts w:ascii="Courier New" w:hAnsi="Courier New" w:eastAsia="Courier New" w:cs="Courier New"/>
+                <w:b w:val="0"/>
+                <w:i w:val="0"/>
+                <w:color w:val="000000"/>
+                <w:sz w:val="22"/>
+              </w:rPr>
+              <w:t xml:space="preserve">                Text(</w:t>
+            </w:r>
+          </w:p>
+          <w:p>
+            <w:pPr>
+              <w:keepNext w:val="0"/>
+              <w:keepLines w:val="0"/>
+              <w:spacing w:before="0" w:after="0" w:line="240" w:lineRule="auto"/>
+              <w:ind w:left="0" w:right="0" w:firstLine="0"/>
+            </w:pPr>
+            <w:r>
+              <w:rPr>
+                <w:rFonts w:ascii="Courier New" w:hAnsi="Courier New" w:eastAsia="Courier New" w:cs="Courier New"/>
+                <w:b w:val="0"/>
+                <w:i w:val="0"/>
+                <w:color w:val="000000"/>
+                <w:sz w:val="22"/>
+              </w:rPr>
+              <w:t xml:space="preserve">                    "Type: ${item.event.eventType.label}",</w:t>
+            </w:r>
+          </w:p>
+          <w:p>
+            <w:pPr>
+              <w:keepNext w:val="0"/>
+              <w:keepLines w:val="0"/>
+              <w:spacing w:before="0" w:after="0" w:line="240" w:lineRule="auto"/>
+              <w:ind w:left="0" w:right="0" w:firstLine="0"/>
+            </w:pPr>
+            <w:r>
+              <w:rPr>
+                <w:rFonts w:ascii="Courier New" w:hAnsi="Courier New" w:eastAsia="Courier New" w:cs="Courier New"/>
+                <w:b w:val="0"/>
+                <w:i w:val="0"/>
+                <w:color w:val="000000"/>
+                <w:sz w:val="22"/>
+              </w:rPr>
+              <w:t xml:space="preserve">                    modifier = Modifier.weight(1f),</w:t>
+            </w:r>
+          </w:p>
+          <w:p>
+            <w:pPr>
+              <w:keepNext w:val="0"/>
+              <w:keepLines w:val="0"/>
+              <w:spacing w:before="0" w:after="0" w:line="240" w:lineRule="auto"/>
+              <w:ind w:left="0" w:right="0" w:firstLine="0"/>
+            </w:pPr>
+            <w:r>
+              <w:rPr>
+                <w:rFonts w:ascii="Courier New" w:hAnsi="Courier New" w:eastAsia="Courier New" w:cs="Courier New"/>
+                <w:b w:val="0"/>
+                <w:i w:val="0"/>
+                <w:color w:val="000000"/>
+                <w:sz w:val="22"/>
+              </w:rPr>
+              <w:t xml:space="preserve">                    style = MaterialTheme.typography.labelLarge,</w:t>
+            </w:r>
+          </w:p>
+          <w:p>
+            <w:pPr>
+              <w:keepNext w:val="0"/>
+              <w:keepLines w:val="0"/>
+              <w:spacing w:before="0" w:after="0" w:line="240" w:lineRule="auto"/>
+              <w:ind w:left="0" w:right="0" w:firstLine="0"/>
+            </w:pPr>
+            <w:r>
+              <w:rPr>
+                <w:rFonts w:ascii="Courier New" w:hAnsi="Courier New" w:eastAsia="Courier New" w:cs="Courier New"/>
+                <w:b w:val="0"/>
+                <w:i w:val="0"/>
+                <w:color w:val="000000"/>
+                <w:sz w:val="22"/>
+              </w:rPr>
+              <w:t xml:space="preserve">                    color = MaterialTheme.colorScheme.primary</w:t>
+            </w:r>
+          </w:p>
+          <w:p>
+            <w:pPr>
+              <w:keepNext w:val="0"/>
+              <w:keepLines w:val="0"/>
+              <w:spacing w:before="0" w:after="0" w:line="240" w:lineRule="auto"/>
+              <w:ind w:left="0" w:right="0" w:firstLine="0"/>
+            </w:pPr>
+            <w:r>
+              <w:rPr>
+                <w:rFonts w:ascii="Courier New" w:hAnsi="Courier New" w:eastAsia="Courier New" w:cs="Courier New"/>
+                <w:b w:val="0"/>
+                <w:i w:val="0"/>
+                <w:color w:val="000000"/>
+                <w:sz w:val="22"/>
+              </w:rPr>
+              <w:t xml:space="preserve">                )</w:t>
+            </w:r>
+          </w:p>
+          <w:p>
+            <w:pPr>
+              <w:keepNext w:val="0"/>
+              <w:keepLines w:val="0"/>
+              <w:spacing w:before="0" w:after="0" w:line="240" w:lineRule="auto"/>
+              <w:ind w:left="0" w:right="0" w:firstLine="0"/>
+            </w:pPr>
+            <w:r>
+              <w:rPr>
+                <w:rFonts w:ascii="Courier New" w:hAnsi="Courier New" w:eastAsia="Courier New" w:cs="Courier New"/>
+                <w:b w:val="0"/>
+                <w:i w:val="0"/>
+                <w:color w:val="000000"/>
+                <w:sz w:val="22"/>
+              </w:rPr>
+              <w:t xml:space="preserve">                Text(</w:t>
+            </w:r>
+          </w:p>
+          <w:p>
+            <w:pPr>
+              <w:keepNext w:val="0"/>
+              <w:keepLines w:val="0"/>
+              <w:spacing w:before="0" w:after="0" w:line="240" w:lineRule="auto"/>
+              <w:ind w:left="0" w:right="0" w:firstLine="0"/>
+            </w:pPr>
+            <w:r>
+              <w:rPr>
+                <w:rFonts w:ascii="Courier New" w:hAnsi="Courier New" w:eastAsia="Courier New" w:cs="Courier New"/>
+                <w:b w:val="0"/>
+                <w:i w:val="0"/>
+                <w:color w:val="000000"/>
+                <w:sz w:val="22"/>
+              </w:rPr>
+              <w:t xml:space="preserve">                    "Status: ${item.event.status.label}",</w:t>
+            </w:r>
+          </w:p>
+          <w:p>
+            <w:pPr>
+              <w:keepNext w:val="0"/>
+              <w:keepLines w:val="0"/>
+              <w:spacing w:before="0" w:after="0" w:line="240" w:lineRule="auto"/>
+              <w:ind w:left="0" w:right="0" w:firstLine="0"/>
+            </w:pPr>
+            <w:r>
+              <w:rPr>
+                <w:rFonts w:ascii="Courier New" w:hAnsi="Courier New" w:eastAsia="Courier New" w:cs="Courier New"/>
+                <w:b w:val="0"/>
+                <w:i w:val="0"/>
+                <w:color w:val="000000"/>
+                <w:sz w:val="22"/>
+              </w:rPr>
+              <w:t xml:space="preserve">                    modifier = Modifier.weight(1f),</w:t>
+            </w:r>
+          </w:p>
+          <w:p>
+            <w:pPr>
+              <w:keepNext w:val="0"/>
+              <w:keepLines w:val="0"/>
+              <w:spacing w:before="0" w:after="0" w:line="240" w:lineRule="auto"/>
+              <w:ind w:left="0" w:right="0" w:firstLine="0"/>
+            </w:pPr>
+            <w:r>
+              <w:rPr>
+                <w:rFonts w:ascii="Courier New" w:hAnsi="Courier New" w:eastAsia="Courier New" w:cs="Courier New"/>
+                <w:b w:val="0"/>
+                <w:i w:val="0"/>
+                <w:color w:val="000000"/>
+                <w:sz w:val="22"/>
+              </w:rPr>
+              <w:t xml:space="preserve">                    style = MaterialTheme.typography.labelLarge,</w:t>
+            </w:r>
+          </w:p>
+          <w:p>
+            <w:pPr>
+              <w:keepNext w:val="0"/>
+              <w:keepLines w:val="0"/>
+              <w:spacing w:before="0" w:after="0" w:line="240" w:lineRule="auto"/>
+              <w:ind w:left="0" w:right="0" w:firstLine="0"/>
+            </w:pPr>
+            <w:r>
+              <w:rPr>
+                <w:rFonts w:ascii="Courier New" w:hAnsi="Courier New" w:eastAsia="Courier New" w:cs="Courier New"/>
+                <w:b w:val="0"/>
+                <w:i w:val="0"/>
+                <w:color w:val="000000"/>
+                <w:sz w:val="22"/>
+              </w:rPr>
+              <w:t xml:space="preserve">                    color = MaterialTheme.colorScheme.secondary</w:t>
+            </w:r>
+          </w:p>
+          <w:p>
+            <w:pPr>
+              <w:keepNext w:val="0"/>
+              <w:keepLines w:val="0"/>
+              <w:spacing w:before="0" w:after="0" w:line="240" w:lineRule="auto"/>
+              <w:ind w:left="0" w:right="0" w:firstLine="0"/>
+            </w:pPr>
+            <w:r>
+              <w:rPr>
+                <w:rFonts w:ascii="Courier New" w:hAnsi="Courier New" w:eastAsia="Courier New" w:cs="Courier New"/>
+                <w:b w:val="0"/>
+                <w:i w:val="0"/>
+                <w:color w:val="000000"/>
+                <w:sz w:val="22"/>
+              </w:rPr>
+              <w:t xml:space="preserve">                )</w:t>
+            </w:r>
+          </w:p>
+          <w:p>
+            <w:pPr>
+              <w:keepNext w:val="0"/>
+              <w:keepLines w:val="0"/>
+              <w:spacing w:before="0" w:after="0" w:line="240" w:lineRule="auto"/>
+              <w:ind w:left="0" w:right="0" w:firstLine="0"/>
+            </w:pPr>
+            <w:r>
+              <w:rPr>
+                <w:rFonts w:ascii="Courier New" w:hAnsi="Courier New" w:eastAsia="Courier New" w:cs="Courier New"/>
+                <w:b w:val="0"/>
+                <w:i w:val="0"/>
+                <w:color w:val="000000"/>
+                <w:sz w:val="22"/>
+              </w:rPr>
+              <w:t xml:space="preserve">            }</w:t>
             </w:r>
           </w:p>
           <w:p>

</xml_diff>

<commit_message>
Add verified Event Manager screenshots
</commit_message>
<xml_diff>
--- a/coursework-documents/COMP1786_CW2_Exercise_2_Logbook.docx
+++ b/coursework-documents/COMP1786_CW2_Exercise_2_Logbook.docx
@@ -475,7 +475,7 @@
           <w:color w:val="000000"/>
           <w:sz w:val="22"/>
         </w:rPr>
-        <w:t>The native code and automated checks are complete. This computer has no configured Android virtual device, so the clearly marked panels below must be replaced with genuine screenshots captured from a device or emulator before submission.</w:t>
+        <w:t>The following genuine Android screenshots show the completed exercise, valid unit conversions and input validation on a running device or emulator.</w:t>
       </w:r>
     </w:p>
     <w:p>
@@ -507,18 +507,17 @@
         <w:tc>
           <w:tcPr>
             <w:tcW w:type="dxa" w:w="9922"/>
-            <w:shd w:fill="FFF2CC"/>
             <w:tcBorders>
-              <w:top w:val="single" w:sz="14" w:color="FFC000"/>
-              <w:left w:val="single" w:sz="14" w:color="FFC000"/>
-              <w:bottom w:val="single" w:sz="14" w:color="FFC000"/>
-              <w:right w:val="single" w:sz="14" w:color="FFC000"/>
+              <w:top w:val="single" w:sz="8" w:color="F2F2F2"/>
+              <w:left w:val="single" w:sz="8" w:color="F2F2F2"/>
+              <w:bottom w:val="single" w:sz="8" w:color="F2F2F2"/>
+              <w:right w:val="single" w:sz="8" w:color="F2F2F2"/>
             </w:tcBorders>
             <w:tcMar>
-              <w:top w:w="220" w:type="dxa"/>
-              <w:start w:w="220" w:type="dxa"/>
-              <w:bottom w:w="220" w:type="dxa"/>
-              <w:end w:w="220" w:type="dxa"/>
+              <w:top w:w="120" w:type="dxa"/>
+              <w:start w:w="120" w:type="dxa"/>
+              <w:bottom w:w="120" w:type="dxa"/>
+              <w:end w:w="120" w:type="dxa"/>
             </w:tcMar>
             <w:vAlign w:val="center"/>
           </w:tcPr>
@@ -530,44 +529,41 @@
             <w:r>
               <w:rPr>
                 <w:rFonts w:ascii="Arial" w:hAnsi="Arial" w:eastAsia="Arial" w:cs="Arial"/>
-                <w:b/>
-                <w:i w:val="0"/>
-                <w:color w:val="000000"/>
-                <w:sz w:val="28"/>
-              </w:rPr>
-              <w:t>GENUINE ANDROID SCREENSHOT REQUIRED</w:t>
-            </w:r>
-          </w:p>
-          <w:p>
-            <w:pPr>
-              <w:spacing w:line="360" w:lineRule="auto"/>
-              <w:jc w:val="center"/>
-            </w:pPr>
-            <w:r>
-              <w:rPr>
-                <w:rFonts w:ascii="Arial" w:hAnsi="Arial" w:eastAsia="Arial" w:cs="Arial"/>
-                <w:b w:val="0"/>
-                <w:i w:val="0"/>
-                <w:color w:val="000000"/>
-                <w:sz w:val="22"/>
-              </w:rPr>
-              <w:t>Run app after clearing its data and capture No events yet plus the New event action.</w:t>
-            </w:r>
-          </w:p>
-          <w:p>
-            <w:pPr>
-              <w:spacing w:line="360" w:lineRule="auto"/>
-              <w:jc w:val="center"/>
-            </w:pPr>
-            <w:r>
-              <w:rPr>
-                <w:rFonts w:ascii="Arial" w:hAnsi="Arial" w:eastAsia="Arial" w:cs="Arial"/>
-                <w:b/>
-                <w:i w:val="0"/>
-                <w:color w:val="000000"/>
-                <w:sz w:val="22"/>
-              </w:rPr>
-              <w:t>Replace this entire yellow panel with the screenshot.</w:t>
+                <w:color w:val="000000"/>
+                <w:sz w:val="22"/>
+              </w:rPr>
+              <w:drawing>
+                <wp:inline xmlns:a="http://schemas.openxmlformats.org/drawingml/2006/main" xmlns:pic="http://schemas.openxmlformats.org/drawingml/2006/picture">
+                  <wp:extent cx="2651760" cy="5913332"/>
+                  <wp:docPr id="1" name="Picture 1" descr="BMI Calculator screenshot showing empty event list. The initial list and the entry point for adding an event."/>
+                  <wp:cNvGraphicFramePr>
+                    <a:graphicFrameLocks noChangeAspect="1"/>
+                  </wp:cNvGraphicFramePr>
+                  <a:graphic>
+                    <a:graphicData uri="http://schemas.openxmlformats.org/drawingml/2006/picture">
+                      <pic:pic>
+                        <pic:nvPicPr>
+                          <pic:cNvPr id="0" name="admin-empty-state.jpg"/>
+                          <pic:cNvPicPr/>
+                        </pic:nvPicPr>
+                        <pic:blipFill>
+                          <a:blip r:embed="rId13"/>
+                          <a:stretch>
+                            <a:fillRect/>
+                          </a:stretch>
+                        </pic:blipFill>
+                        <pic:spPr>
+                          <a:xfrm>
+                            <a:off x="0" y="0"/>
+                            <a:ext cx="2651760" cy="5913332"/>
+                          </a:xfrm>
+                          <a:prstGeom prst="rect"/>
+                        </pic:spPr>
+                      </pic:pic>
+                    </a:graphicData>
+                  </a:graphic>
+                </wp:inline>
+              </w:drawing>
             </w:r>
           </w:p>
         </w:tc>
@@ -630,18 +626,17 @@
         <w:tc>
           <w:tcPr>
             <w:tcW w:type="dxa" w:w="9922"/>
-            <w:shd w:fill="FFF2CC"/>
             <w:tcBorders>
-              <w:top w:val="single" w:sz="14" w:color="FFC000"/>
-              <w:left w:val="single" w:sz="14" w:color="FFC000"/>
-              <w:bottom w:val="single" w:sz="14" w:color="FFC000"/>
-              <w:right w:val="single" w:sz="14" w:color="FFC000"/>
+              <w:top w:val="single" w:sz="8" w:color="F2F2F2"/>
+              <w:left w:val="single" w:sz="8" w:color="F2F2F2"/>
+              <w:bottom w:val="single" w:sz="8" w:color="F2F2F2"/>
+              <w:right w:val="single" w:sz="8" w:color="F2F2F2"/>
             </w:tcBorders>
             <w:tcMar>
-              <w:top w:w="220" w:type="dxa"/>
-              <w:start w:w="220" w:type="dxa"/>
-              <w:bottom w:w="220" w:type="dxa"/>
-              <w:end w:w="220" w:type="dxa"/>
+              <w:top w:w="120" w:type="dxa"/>
+              <w:start w:w="120" w:type="dxa"/>
+              <w:bottom w:w="120" w:type="dxa"/>
+              <w:end w:w="120" w:type="dxa"/>
             </w:tcMar>
             <w:vAlign w:val="center"/>
           </w:tcPr>
@@ -653,44 +648,41 @@
             <w:r>
               <w:rPr>
                 <w:rFonts w:ascii="Arial" w:hAnsi="Arial" w:eastAsia="Arial" w:cs="Arial"/>
-                <w:b/>
-                <w:i w:val="0"/>
-                <w:color w:val="000000"/>
-                <w:sz w:val="28"/>
-              </w:rPr>
-              <w:t>GENUINE ANDROID SCREENSHOT REQUIRED</w:t>
-            </w:r>
-          </w:p>
-          <w:p>
-            <w:pPr>
-              <w:spacing w:line="360" w:lineRule="auto"/>
-              <w:jc w:val="center"/>
-            </w:pPr>
-            <w:r>
-              <w:rPr>
-                <w:rFonts w:ascii="Arial" w:hAnsi="Arial" w:eastAsia="Arial" w:cs="Arial"/>
-                <w:b w:val="0"/>
-                <w:i w:val="0"/>
-                <w:color w:val="000000"/>
-                <w:sz w:val="22"/>
-              </w:rPr>
-              <w:t>Open New event and capture name, date picker, organiser, type, status, location and optional details.</w:t>
-            </w:r>
-          </w:p>
-          <w:p>
-            <w:pPr>
-              <w:spacing w:line="360" w:lineRule="auto"/>
-              <w:jc w:val="center"/>
-            </w:pPr>
-            <w:r>
-              <w:rPr>
-                <w:rFonts w:ascii="Arial" w:hAnsi="Arial" w:eastAsia="Arial" w:cs="Arial"/>
-                <w:b/>
-                <w:i w:val="0"/>
-                <w:color w:val="000000"/>
-                <w:sz w:val="22"/>
-              </w:rPr>
-              <w:t>Replace this entire yellow panel with the screenshot.</w:t>
+                <w:color w:val="000000"/>
+                <w:sz w:val="22"/>
+              </w:rPr>
+              <w:drawing>
+                <wp:inline xmlns:a="http://schemas.openxmlformats.org/drawingml/2006/main" xmlns:pic="http://schemas.openxmlformats.org/drawingml/2006/picture">
+                  <wp:extent cx="2651760" cy="5913332"/>
+                  <wp:docPr id="2" name="Picture 2" descr="BMI Calculator screenshot showing add event form. Suitable controls for all required event fields; the date is selected, not typed."/>
+                  <wp:cNvGraphicFramePr>
+                    <a:graphicFrameLocks noChangeAspect="1"/>
+                  </wp:cNvGraphicFramePr>
+                  <a:graphic>
+                    <a:graphicData uri="http://schemas.openxmlformats.org/drawingml/2006/picture">
+                      <pic:pic>
+                        <pic:nvPicPr>
+                          <pic:cNvPr id="0" name="admin-add-event-form.jpg"/>
+                          <pic:cNvPicPr/>
+                        </pic:nvPicPr>
+                        <pic:blipFill>
+                          <a:blip r:embed="rId14"/>
+                          <a:stretch>
+                            <a:fillRect/>
+                          </a:stretch>
+                        </pic:blipFill>
+                        <pic:spPr>
+                          <a:xfrm>
+                            <a:off x="0" y="0"/>
+                            <a:ext cx="2651760" cy="5913332"/>
+                          </a:xfrm>
+                          <a:prstGeom prst="rect"/>
+                        </pic:spPr>
+                      </pic:pic>
+                    </a:graphicData>
+                  </a:graphic>
+                </wp:inline>
+              </w:drawing>
             </w:r>
           </w:p>
         </w:tc>
@@ -753,18 +745,17 @@
         <w:tc>
           <w:tcPr>
             <w:tcW w:type="dxa" w:w="9922"/>
-            <w:shd w:fill="FFF2CC"/>
             <w:tcBorders>
-              <w:top w:val="single" w:sz="14" w:color="FFC000"/>
-              <w:left w:val="single" w:sz="14" w:color="FFC000"/>
-              <w:bottom w:val="single" w:sz="14" w:color="FFC000"/>
-              <w:right w:val="single" w:sz="14" w:color="FFC000"/>
+              <w:top w:val="single" w:sz="8" w:color="F2F2F2"/>
+              <w:left w:val="single" w:sz="8" w:color="F2F2F2"/>
+              <w:bottom w:val="single" w:sz="8" w:color="F2F2F2"/>
+              <w:right w:val="single" w:sz="8" w:color="F2F2F2"/>
             </w:tcBorders>
             <w:tcMar>
-              <w:top w:w="220" w:type="dxa"/>
-              <w:start w:w="220" w:type="dxa"/>
-              <w:bottom w:w="220" w:type="dxa"/>
-              <w:end w:w="220" w:type="dxa"/>
+              <w:top w:w="120" w:type="dxa"/>
+              <w:start w:w="120" w:type="dxa"/>
+              <w:bottom w:w="120" w:type="dxa"/>
+              <w:end w:w="120" w:type="dxa"/>
             </w:tcMar>
             <w:vAlign w:val="center"/>
           </w:tcPr>
@@ -776,44 +767,41 @@
             <w:r>
               <w:rPr>
                 <w:rFonts w:ascii="Arial" w:hAnsi="Arial" w:eastAsia="Arial" w:cs="Arial"/>
-                <w:b/>
-                <w:i w:val="0"/>
-                <w:color w:val="000000"/>
-                <w:sz w:val="28"/>
-              </w:rPr>
-              <w:t>GENUINE ANDROID SCREENSHOT REQUIRED</w:t>
-            </w:r>
-          </w:p>
-          <w:p>
-            <w:pPr>
-              <w:spacing w:line="360" w:lineRule="auto"/>
-              <w:jc w:val="center"/>
-            </w:pPr>
-            <w:r>
-              <w:rPr>
-                <w:rFonts w:ascii="Arial" w:hAnsi="Arial" w:eastAsia="Arial" w:cs="Arial"/>
-                <w:b w:val="0"/>
-                <w:i w:val="0"/>
-                <w:color w:val="000000"/>
-                <w:sz w:val="22"/>
-              </w:rPr>
-              <w:t>Open Event type and capture Conference, Workshop, Seminar, Social and Other.</w:t>
-            </w:r>
-          </w:p>
-          <w:p>
-            <w:pPr>
-              <w:spacing w:line="360" w:lineRule="auto"/>
-              <w:jc w:val="center"/>
-            </w:pPr>
-            <w:r>
-              <w:rPr>
-                <w:rFonts w:ascii="Arial" w:hAnsi="Arial" w:eastAsia="Arial" w:cs="Arial"/>
-                <w:b/>
-                <w:i w:val="0"/>
-                <w:color w:val="000000"/>
-                <w:sz w:val="22"/>
-              </w:rPr>
-              <w:t>Replace this entire yellow panel with the screenshot.</w:t>
+                <w:color w:val="000000"/>
+                <w:sz w:val="22"/>
+              </w:rPr>
+              <w:drawing>
+                <wp:inline xmlns:a="http://schemas.openxmlformats.org/drawingml/2006/main" xmlns:pic="http://schemas.openxmlformats.org/drawingml/2006/picture">
+                  <wp:extent cx="2651760" cy="5913332"/>
+                  <wp:docPr id="3" name="Picture 3" descr="BMI Calculator screenshot showing event type menu. The exact predefined types are selectable and invalid free text is impossible."/>
+                  <wp:cNvGraphicFramePr>
+                    <a:graphicFrameLocks noChangeAspect="1"/>
+                  </wp:cNvGraphicFramePr>
+                  <a:graphic>
+                    <a:graphicData uri="http://schemas.openxmlformats.org/drawingml/2006/picture">
+                      <pic:pic>
+                        <pic:nvPicPr>
+                          <pic:cNvPr id="0" name="admin-event-type-menu.jpg"/>
+                          <pic:cNvPicPr/>
+                        </pic:nvPicPr>
+                        <pic:blipFill>
+                          <a:blip r:embed="rId15"/>
+                          <a:stretch>
+                            <a:fillRect/>
+                          </a:stretch>
+                        </pic:blipFill>
+                        <pic:spPr>
+                          <a:xfrm>
+                            <a:off x="0" y="0"/>
+                            <a:ext cx="2651760" cy="5913332"/>
+                          </a:xfrm>
+                          <a:prstGeom prst="rect"/>
+                        </pic:spPr>
+                      </pic:pic>
+                    </a:graphicData>
+                  </a:graphic>
+                </wp:inline>
+              </w:drawing>
             </w:r>
           </w:p>
         </w:tc>
@@ -876,18 +864,17 @@
         <w:tc>
           <w:tcPr>
             <w:tcW w:type="dxa" w:w="9922"/>
-            <w:shd w:fill="FFF2CC"/>
             <w:tcBorders>
-              <w:top w:val="single" w:sz="14" w:color="FFC000"/>
-              <w:left w:val="single" w:sz="14" w:color="FFC000"/>
-              <w:bottom w:val="single" w:sz="14" w:color="FFC000"/>
-              <w:right w:val="single" w:sz="14" w:color="FFC000"/>
+              <w:top w:val="single" w:sz="8" w:color="F2F2F2"/>
+              <w:left w:val="single" w:sz="8" w:color="F2F2F2"/>
+              <w:bottom w:val="single" w:sz="8" w:color="F2F2F2"/>
+              <w:right w:val="single" w:sz="8" w:color="F2F2F2"/>
             </w:tcBorders>
             <w:tcMar>
-              <w:top w:w="220" w:type="dxa"/>
-              <w:start w:w="220" w:type="dxa"/>
-              <w:bottom w:w="220" w:type="dxa"/>
-              <w:end w:w="220" w:type="dxa"/>
+              <w:top w:w="120" w:type="dxa"/>
+              <w:start w:w="120" w:type="dxa"/>
+              <w:bottom w:w="120" w:type="dxa"/>
+              <w:end w:w="120" w:type="dxa"/>
             </w:tcMar>
             <w:vAlign w:val="center"/>
           </w:tcPr>
@@ -899,44 +886,41 @@
             <w:r>
               <w:rPr>
                 <w:rFonts w:ascii="Arial" w:hAnsi="Arial" w:eastAsia="Arial" w:cs="Arial"/>
-                <w:b/>
-                <w:i w:val="0"/>
-                <w:color w:val="000000"/>
-                <w:sz w:val="28"/>
-              </w:rPr>
-              <w:t>GENUINE ANDROID SCREENSHOT REQUIRED</w:t>
-            </w:r>
-          </w:p>
-          <w:p>
-            <w:pPr>
-              <w:spacing w:line="360" w:lineRule="auto"/>
-              <w:jc w:val="center"/>
-            </w:pPr>
-            <w:r>
-              <w:rPr>
-                <w:rFonts w:ascii="Arial" w:hAnsi="Arial" w:eastAsia="Arial" w:cs="Arial"/>
-                <w:b w:val="0"/>
-                <w:i w:val="0"/>
-                <w:color w:val="000000"/>
-                <w:sz w:val="22"/>
-              </w:rPr>
-              <w:t>Leave required values empty, tap Review event and capture inline errors.</w:t>
-            </w:r>
-          </w:p>
-          <w:p>
-            <w:pPr>
-              <w:spacing w:line="360" w:lineRule="auto"/>
-              <w:jc w:val="center"/>
-            </w:pPr>
-            <w:r>
-              <w:rPr>
-                <w:rFonts w:ascii="Arial" w:hAnsi="Arial" w:eastAsia="Arial" w:cs="Arial"/>
-                <w:b/>
-                <w:i w:val="0"/>
-                <w:color w:val="000000"/>
-                <w:sz w:val="22"/>
-              </w:rPr>
-              <w:t>Replace this entire yellow panel with the screenshot.</w:t>
+                <w:color w:val="000000"/>
+                <w:sz w:val="22"/>
+              </w:rPr>
+              <w:drawing>
+                <wp:inline xmlns:a="http://schemas.openxmlformats.org/drawingml/2006/main" xmlns:pic="http://schemas.openxmlformats.org/drawingml/2006/picture">
+                  <wp:extent cx="2651760" cy="5913332"/>
+                  <wp:docPr id="4" name="Picture 4" descr="BMI Calculator screenshot showing required validation. Incomplete data is rejected without losing the form."/>
+                  <wp:cNvGraphicFramePr>
+                    <a:graphicFrameLocks noChangeAspect="1"/>
+                  </wp:cNvGraphicFramePr>
+                  <a:graphic>
+                    <a:graphicData uri="http://schemas.openxmlformats.org/drawingml/2006/picture">
+                      <pic:pic>
+                        <pic:nvPicPr>
+                          <pic:cNvPr id="0" name="admin-required-validation.jpg"/>
+                          <pic:cNvPicPr/>
+                        </pic:nvPicPr>
+                        <pic:blipFill>
+                          <a:blip r:embed="rId16"/>
+                          <a:stretch>
+                            <a:fillRect/>
+                          </a:stretch>
+                        </pic:blipFill>
+                        <pic:spPr>
+                          <a:xfrm>
+                            <a:off x="0" y="0"/>
+                            <a:ext cx="2651760" cy="5913332"/>
+                          </a:xfrm>
+                          <a:prstGeom prst="rect"/>
+                        </pic:spPr>
+                      </pic:pic>
+                    </a:graphicData>
+                  </a:graphic>
+                </wp:inline>
+              </w:drawing>
             </w:r>
           </w:p>
         </w:tc>
@@ -999,18 +983,17 @@
         <w:tc>
           <w:tcPr>
             <w:tcW w:type="dxa" w:w="9922"/>
-            <w:shd w:fill="FFF2CC"/>
             <w:tcBorders>
-              <w:top w:val="single" w:sz="14" w:color="FFC000"/>
-              <w:left w:val="single" w:sz="14" w:color="FFC000"/>
-              <w:bottom w:val="single" w:sz="14" w:color="FFC000"/>
-              <w:right w:val="single" w:sz="14" w:color="FFC000"/>
+              <w:top w:val="single" w:sz="8" w:color="F2F2F2"/>
+              <w:left w:val="single" w:sz="8" w:color="F2F2F2"/>
+              <w:bottom w:val="single" w:sz="8" w:color="F2F2F2"/>
+              <w:right w:val="single" w:sz="8" w:color="F2F2F2"/>
             </w:tcBorders>
             <w:tcMar>
-              <w:top w:w="220" w:type="dxa"/>
-              <w:start w:w="220" w:type="dxa"/>
-              <w:bottom w:w="220" w:type="dxa"/>
-              <w:end w:w="220" w:type="dxa"/>
+              <w:top w:w="120" w:type="dxa"/>
+              <w:start w:w="120" w:type="dxa"/>
+              <w:bottom w:w="120" w:type="dxa"/>
+              <w:end w:w="120" w:type="dxa"/>
             </w:tcMar>
             <w:vAlign w:val="center"/>
           </w:tcPr>
@@ -1022,44 +1005,41 @@
             <w:r>
               <w:rPr>
                 <w:rFonts w:ascii="Arial" w:hAnsi="Arial" w:eastAsia="Arial" w:cs="Arial"/>
-                <w:b/>
-                <w:i w:val="0"/>
-                <w:color w:val="000000"/>
-                <w:sz w:val="28"/>
-              </w:rPr>
-              <w:t>GENUINE ANDROID SCREENSHOT REQUIRED</w:t>
-            </w:r>
-          </w:p>
-          <w:p>
-            <w:pPr>
-              <w:spacing w:line="360" w:lineRule="auto"/>
-              <w:jc w:val="center"/>
-            </w:pPr>
-            <w:r>
-              <w:rPr>
-                <w:rFonts w:ascii="Arial" w:hAnsi="Arial" w:eastAsia="Arial" w:cs="Arial"/>
-                <w:b w:val="0"/>
-                <w:i w:val="0"/>
-                <w:color w:val="000000"/>
-                <w:sz w:val="22"/>
-              </w:rPr>
-              <w:t>Enter a complete event, tap Review event and capture Confirm event details.</w:t>
-            </w:r>
-          </w:p>
-          <w:p>
-            <w:pPr>
-              <w:spacing w:line="360" w:lineRule="auto"/>
-              <w:jc w:val="center"/>
-            </w:pPr>
-            <w:r>
-              <w:rPr>
-                <w:rFonts w:ascii="Arial" w:hAnsi="Arial" w:eastAsia="Arial" w:cs="Arial"/>
-                <w:b/>
-                <w:i w:val="0"/>
-                <w:color w:val="000000"/>
-                <w:sz w:val="22"/>
-              </w:rPr>
-              <w:t>Replace this entire yellow panel with the screenshot.</w:t>
+                <w:color w:val="000000"/>
+                <w:sz w:val="22"/>
+              </w:rPr>
+              <w:drawing>
+                <wp:inline xmlns:a="http://schemas.openxmlformats.org/drawingml/2006/main" xmlns:pic="http://schemas.openxmlformats.org/drawingml/2006/picture">
+                  <wp:extent cx="2651760" cy="5913332"/>
+                  <wp:docPr id="5" name="Picture 5" descr="BMI Calculator screenshot showing confirmation. The user can verify or edit values before saving."/>
+                  <wp:cNvGraphicFramePr>
+                    <a:graphicFrameLocks noChangeAspect="1"/>
+                  </wp:cNvGraphicFramePr>
+                  <a:graphic>
+                    <a:graphicData uri="http://schemas.openxmlformats.org/drawingml/2006/picture">
+                      <pic:pic>
+                        <pic:nvPicPr>
+                          <pic:cNvPr id="0" name="admin-event-confirmation.jpg"/>
+                          <pic:cNvPicPr/>
+                        </pic:nvPicPr>
+                        <pic:blipFill>
+                          <a:blip r:embed="rId17"/>
+                          <a:stretch>
+                            <a:fillRect/>
+                          </a:stretch>
+                        </pic:blipFill>
+                        <pic:spPr>
+                          <a:xfrm>
+                            <a:off x="0" y="0"/>
+                            <a:ext cx="2651760" cy="5913332"/>
+                          </a:xfrm>
+                          <a:prstGeom prst="rect"/>
+                        </pic:spPr>
+                      </pic:pic>
+                    </a:graphicData>
+                  </a:graphic>
+                </wp:inline>
+              </w:drawing>
             </w:r>
           </w:p>
         </w:tc>
@@ -1122,18 +1102,17 @@
         <w:tc>
           <w:tcPr>
             <w:tcW w:type="dxa" w:w="9922"/>
-            <w:shd w:fill="FFF2CC"/>
             <w:tcBorders>
-              <w:top w:val="single" w:sz="14" w:color="FFC000"/>
-              <w:left w:val="single" w:sz="14" w:color="FFC000"/>
-              <w:bottom w:val="single" w:sz="14" w:color="FFC000"/>
-              <w:right w:val="single" w:sz="14" w:color="FFC000"/>
+              <w:top w:val="single" w:sz="8" w:color="F2F2F2"/>
+              <w:left w:val="single" w:sz="8" w:color="F2F2F2"/>
+              <w:bottom w:val="single" w:sz="8" w:color="F2F2F2"/>
+              <w:right w:val="single" w:sz="8" w:color="F2F2F2"/>
             </w:tcBorders>
             <w:tcMar>
-              <w:top w:w="220" w:type="dxa"/>
-              <w:start w:w="220" w:type="dxa"/>
-              <w:bottom w:w="220" w:type="dxa"/>
-              <w:end w:w="220" w:type="dxa"/>
+              <w:top w:w="120" w:type="dxa"/>
+              <w:start w:w="120" w:type="dxa"/>
+              <w:bottom w:w="120" w:type="dxa"/>
+              <w:end w:w="120" w:type="dxa"/>
             </w:tcMar>
             <w:vAlign w:val="center"/>
           </w:tcPr>
@@ -1145,44 +1124,41 @@
             <w:r>
               <w:rPr>
                 <w:rFonts w:ascii="Arial" w:hAnsi="Arial" w:eastAsia="Arial" w:cs="Arial"/>
-                <w:b/>
-                <w:i w:val="0"/>
-                <w:color w:val="000000"/>
-                <w:sz w:val="28"/>
-              </w:rPr>
-              <w:t>GENUINE ANDROID SCREENSHOT REQUIRED</w:t>
-            </w:r>
-          </w:p>
-          <w:p>
-            <w:pPr>
-              <w:spacing w:line="360" w:lineRule="auto"/>
-              <w:jc w:val="center"/>
-            </w:pPr>
-            <w:r>
-              <w:rPr>
-                <w:rFonts w:ascii="Arial" w:hAnsi="Arial" w:eastAsia="Arial" w:cs="Arial"/>
-                <w:b w:val="0"/>
-                <w:i w:val="0"/>
-                <w:color w:val="000000"/>
-                <w:sz w:val="22"/>
-              </w:rPr>
-              <w:t>Confirm the event and capture its card with formatted date, organiser, location and type.</w:t>
-            </w:r>
-          </w:p>
-          <w:p>
-            <w:pPr>
-              <w:spacing w:line="360" w:lineRule="auto"/>
-              <w:jc w:val="center"/>
-            </w:pPr>
-            <w:r>
-              <w:rPr>
-                <w:rFonts w:ascii="Arial" w:hAnsi="Arial" w:eastAsia="Arial" w:cs="Arial"/>
-                <w:b/>
-                <w:i w:val="0"/>
-                <w:color w:val="000000"/>
-                <w:sz w:val="22"/>
-              </w:rPr>
-              <w:t>Replace this entire yellow panel with the screenshot.</w:t>
+                <w:color w:val="000000"/>
+                <w:sz w:val="22"/>
+              </w:rPr>
+              <w:drawing>
+                <wp:inline xmlns:a="http://schemas.openxmlformats.org/drawingml/2006/main" xmlns:pic="http://schemas.openxmlformats.org/drawingml/2006/picture">
+                  <wp:extent cx="2651760" cy="5913332"/>
+                  <wp:docPr id="6" name="Picture 6" descr="BMI Calculator screenshot showing saved event. A valid event is added and displayed in the list."/>
+                  <wp:cNvGraphicFramePr>
+                    <a:graphicFrameLocks noChangeAspect="1"/>
+                  </wp:cNvGraphicFramePr>
+                  <a:graphic>
+                    <a:graphicData uri="http://schemas.openxmlformats.org/drawingml/2006/picture">
+                      <pic:pic>
+                        <pic:nvPicPr>
+                          <pic:cNvPr id="0" name="admin-saved-event.jpg"/>
+                          <pic:cNvPicPr/>
+                        </pic:nvPicPr>
+                        <pic:blipFill>
+                          <a:blip r:embed="rId18"/>
+                          <a:stretch>
+                            <a:fillRect/>
+                          </a:stretch>
+                        </pic:blipFill>
+                        <pic:spPr>
+                          <a:xfrm>
+                            <a:off x="0" y="0"/>
+                            <a:ext cx="2651760" cy="5913332"/>
+                          </a:xfrm>
+                          <a:prstGeom prst="rect"/>
+                        </pic:spPr>
+                      </pic:pic>
+                    </a:graphicData>
+                  </a:graphic>
+                </wp:inline>
+              </w:drawing>
             </w:r>
           </w:p>
         </w:tc>

</xml_diff>